<commit_message>
feat: Add Opmerkingen section to Word report generation
Implemented dynamic Opmerkingen section in formulieren Word reports:
- Filter findings with status !== 'open' as opmerkingen
- Generate separate Opmerkingen section after Bevindingen
- Display "Resultaat: Voldoet maar met opmerking" for remarks
- Label findings as "Opmerking 1", "Opmerking 2" instead of "Bevinding"
- Add customizable section titles and result text
- Enhance gray result boxes with improved spacing and padding
  - Horizontal padding via spaces (2 spaces left/right)
  - Vertical padding via line height (24pt)
  - Top margin: 12pt, Bottom margin: 24pt
- Template updates:
  - Add page break before Opmerkingen heading
  - Adjust TOC structure and spacing
  - Replace "Onderzoek scores" with "Onderzoeksscores"

🤖 Generated with [Claude Code](https://claude.com/claude-code)

Co-Authored-By: Claude <noreply@anthropic.com>
</commit_message>
<xml_diff>
--- a/templates/formulieren/Toegankelijkheidsonderzoek formulieren Template - with placeholders.docx
+++ b/templates/formulieren/Toegankelijkheidsonderzoek formulieren Template - with placeholders.docx
@@ -195,6 +195,7 @@
     </w:p>
     <w:p>
       <w:pPr>
+        <w:spacing w:after="120" w:line="276" w:lineRule="auto"/>
         <w:jc w:val="right"/>
       </w:pPr>
       <w:r>
@@ -236,6 +237,16 @@
       </w:r>
     </w:p>
     <w:bookmarkStart w:id="1" w:name="_Toc223874290" w:displacedByCustomXml="next"/>
+    <w:p>
+      <w:pPr>
+        <w:pStyle w:val="Kop2"/>
+        <w:spacing w:after="120"/>
+      </w:pPr>
+      <w:r>
+        <w:t>Inhoud</w:t>
+      </w:r>
+      <w:bookmarkEnd w:id="1"/>
+    </w:p>
     <w:sdt>
       <w:sdtPr>
         <w:id w:val="-992329338"/>
@@ -259,169 +270,6 @@
       <w:sdtContent>
         <w:p>
           <w:pPr>
-            <w:pStyle w:val="Kopvaninhoudsopgave"/>
-          </w:pPr>
-          <w:r>
-            <w:t>Inhoud</w:t>
-          </w:r>
-          <w:bookmarkEnd w:id="1"/>
-        </w:p>
-        <w:p>
-          <w:pPr>
-            <w:pStyle w:val="Inhopg1"/>
-            <w:tabs>
-              <w:tab w:val="right" w:leader="dot" w:pos="9062"/>
-            </w:tabs>
-            <w:rPr>
-              <w:rFonts w:asciiTheme="minorHAnsi" w:eastAsiaTheme="minorEastAsia" w:hAnsiTheme="minorHAnsi" w:cstheme="minorBidi"/>
-              <w:noProof/>
-              <w:kern w:val="2"/>
-              <w:lang w:eastAsia="nl-NL"/>
-              <w14:ligatures w14:val="standardContextual"/>
-            </w:rPr>
-          </w:pPr>
-          <w:r>
-            <w:fldChar w:fldCharType="begin"/>
-          </w:r>
-          <w:r>
-            <w:instrText xml:space="preserve"> TOC \o "1-3" \h \z \u </w:instrText>
-          </w:r>
-          <w:r>
-            <w:fldChar w:fldCharType="separate"/>
-          </w:r>
-          <w:hyperlink w:anchor="_Toc223874289" w:history="1">
-            <w:r>
-              <w:rPr>
-                <w:rStyle w:val="Hyperlink"/>
-                <w:rFonts w:ascii="Brockmann" w:hAnsi="Brockmann"/>
-                <w:noProof/>
-              </w:rPr>
-              <w:t>Toegankelijkheidsonderzoek formulieren {opdrachtgeverNaam}</w:t>
-            </w:r>
-            <w:r>
-              <w:rPr>
-                <w:noProof/>
-                <w:webHidden/>
-              </w:rPr>
-              <w:tab/>
-            </w:r>
-            <w:r>
-              <w:rPr>
-                <w:noProof/>
-                <w:webHidden/>
-              </w:rPr>
-              <w:fldChar w:fldCharType="begin"/>
-            </w:r>
-            <w:r>
-              <w:rPr>
-                <w:noProof/>
-                <w:webHidden/>
-              </w:rPr>
-              <w:instrText xml:space="preserve"> PAGEREF _Toc223874289 \h </w:instrText>
-            </w:r>
-            <w:r>
-              <w:rPr>
-                <w:noProof/>
-                <w:webHidden/>
-              </w:rPr>
-            </w:r>
-            <w:r>
-              <w:rPr>
-                <w:noProof/>
-                <w:webHidden/>
-              </w:rPr>
-              <w:fldChar w:fldCharType="separate"/>
-            </w:r>
-            <w:r>
-              <w:rPr>
-                <w:noProof/>
-                <w:webHidden/>
-              </w:rPr>
-              <w:t>1</w:t>
-            </w:r>
-            <w:r>
-              <w:rPr>
-                <w:noProof/>
-                <w:webHidden/>
-              </w:rPr>
-              <w:fldChar w:fldCharType="end"/>
-            </w:r>
-          </w:hyperlink>
-        </w:p>
-        <w:p>
-          <w:pPr>
-            <w:pStyle w:val="Inhopg2"/>
-            <w:tabs>
-              <w:tab w:val="right" w:leader="dot" w:pos="9062"/>
-            </w:tabs>
-            <w:rPr>
-              <w:rFonts w:asciiTheme="minorHAnsi" w:eastAsiaTheme="minorEastAsia" w:hAnsiTheme="minorHAnsi" w:cstheme="minorBidi"/>
-              <w:noProof/>
-              <w:kern w:val="2"/>
-              <w:lang w:eastAsia="nl-NL"/>
-              <w14:ligatures w14:val="standardContextual"/>
-            </w:rPr>
-          </w:pPr>
-          <w:hyperlink w:anchor="_Toc223874290" w:history="1">
-            <w:r>
-              <w:rPr>
-                <w:rStyle w:val="Hyperlink"/>
-                <w:noProof/>
-              </w:rPr>
-              <w:t>Inhoud</w:t>
-            </w:r>
-            <w:r>
-              <w:rPr>
-                <w:noProof/>
-                <w:webHidden/>
-              </w:rPr>
-              <w:tab/>
-            </w:r>
-            <w:r>
-              <w:rPr>
-                <w:noProof/>
-                <w:webHidden/>
-              </w:rPr>
-              <w:fldChar w:fldCharType="begin"/>
-            </w:r>
-            <w:r>
-              <w:rPr>
-                <w:noProof/>
-                <w:webHidden/>
-              </w:rPr>
-              <w:instrText xml:space="preserve"> PAGEREF _Toc223874290 \h </w:instrText>
-            </w:r>
-            <w:r>
-              <w:rPr>
-                <w:noProof/>
-                <w:webHidden/>
-              </w:rPr>
-            </w:r>
-            <w:r>
-              <w:rPr>
-                <w:noProof/>
-                <w:webHidden/>
-              </w:rPr>
-              <w:fldChar w:fldCharType="separate"/>
-            </w:r>
-            <w:r>
-              <w:rPr>
-                <w:noProof/>
-                <w:webHidden/>
-              </w:rPr>
-              <w:t>2</w:t>
-            </w:r>
-            <w:r>
-              <w:rPr>
-                <w:noProof/>
-                <w:webHidden/>
-              </w:rPr>
-              <w:fldChar w:fldCharType="end"/>
-            </w:r>
-          </w:hyperlink>
-        </w:p>
-        <w:p>
-          <w:pPr>
             <w:pStyle w:val="Inhopg2"/>
             <w:tabs>
               <w:tab w:val="right" w:leader="dot" w:pos="9062"/>
@@ -800,7 +648,7 @@
                 <w:rStyle w:val="Hyperlink"/>
                 <w:noProof/>
               </w:rPr>
-              <w:t>Onderzoek scores</w:t>
+              <w:t>Onderzoeksscores</w:t>
             </w:r>
             <w:r>
               <w:rPr>
@@ -1666,12 +1514,11 @@
           <w:szCs w:val="32"/>
         </w:rPr>
       </w:pPr>
-      <w:r>
-        <w:br w:type="page"/>
-      </w:r>
-    </w:p>
-    <w:p>
-      <w:pPr>
+      <w:r/>
+    </w:p>
+    <w:p>
+      <w:pPr>
+        <w:pageBreakBefore/>
         <w:pStyle w:val="Kop2"/>
       </w:pPr>
       <w:bookmarkStart w:id="2" w:name="_Toc223874291"/>
@@ -1765,21 +1612,6 @@
       </w:pPr>
       <w:r>
         <w:t>Beide deelonderzoeken vormen gezamenlijk de volledige beoordeling van de formulieren binnen de Shift2-omgeving.</w:t>
-      </w:r>
-    </w:p>
-    <w:p>
-      <w:pPr>
-        <w:suppressAutoHyphens w:val="0"/>
-        <w:spacing w:line="276" w:lineRule="auto"/>
-        <w:rPr>
-          <w:rFonts w:ascii="Brockmann" w:eastAsia="Times New Roman" w:hAnsi="Brockmann"/>
-          <w:b/>
-          <w:iCs/>
-          <w:sz w:val="22"/>
-        </w:rPr>
-      </w:pPr>
-      <w:r>
-        <w:br w:type="page"/>
       </w:r>
     </w:p>
     <w:p>
@@ -1912,6 +1744,7 @@
       <w:tr>
         <w:tc>
           <w:tcPr>
+            <w:vAlign w:val="center"/>
             <w:tcW w:w="1129" w:type="dxa"/>
           </w:tcPr>
           <w:p>
@@ -1935,6 +1768,7 @@
         </w:tc>
         <w:tc>
           <w:tcPr>
+            <w:vAlign w:val="center"/>
             <w:tcW w:w="2410" w:type="dxa"/>
           </w:tcPr>
           <w:p>
@@ -1958,6 +1792,7 @@
         </w:tc>
         <w:tc>
           <w:tcPr>
+            <w:vAlign w:val="center"/>
             <w:tcW w:w="1701" w:type="dxa"/>
           </w:tcPr>
           <w:p>
@@ -1981,6 +1816,7 @@
         </w:tc>
         <w:tc>
           <w:tcPr>
+            <w:vAlign w:val="center"/>
             <w:tcW w:w="3822" w:type="dxa"/>
           </w:tcPr>
           <w:p>
@@ -2006,6 +1842,7 @@
       <w:tr>
         <w:tc>
           <w:tcPr>
+            <w:vAlign w:val="center"/>
             <w:tcW w:w="1129" w:type="dxa"/>
           </w:tcPr>
           <w:p>
@@ -2029,6 +1866,7 @@
         </w:tc>
         <w:tc>
           <w:tcPr>
+            <w:vAlign w:val="center"/>
             <w:tcW w:w="2410" w:type="dxa"/>
           </w:tcPr>
           <w:p>
@@ -2052,6 +1890,7 @@
         </w:tc>
         <w:tc>
           <w:tcPr>
+            <w:vAlign w:val="center"/>
             <w:tcW w:w="1701" w:type="dxa"/>
           </w:tcPr>
           <w:p>
@@ -2075,6 +1914,7 @@
         </w:tc>
         <w:tc>
           <w:tcPr>
+            <w:vAlign w:val="center"/>
             <w:tcW w:w="3822" w:type="dxa"/>
           </w:tcPr>
           <w:p>
@@ -2100,6 +1940,7 @@
       <w:tr>
         <w:tc>
           <w:tcPr>
+            <w:vAlign w:val="center"/>
             <w:tcW w:w="1129" w:type="dxa"/>
           </w:tcPr>
           <w:p>
@@ -2123,6 +1964,7 @@
         </w:tc>
         <w:tc>
           <w:tcPr>
+            <w:vAlign w:val="center"/>
             <w:tcW w:w="2410" w:type="dxa"/>
           </w:tcPr>
           <w:p>
@@ -2146,6 +1988,7 @@
         </w:tc>
         <w:tc>
           <w:tcPr>
+            <w:vAlign w:val="center"/>
             <w:tcW w:w="1701" w:type="dxa"/>
           </w:tcPr>
           <w:p>
@@ -2169,6 +2012,7 @@
         </w:tc>
         <w:tc>
           <w:tcPr>
+            <w:vAlign w:val="center"/>
             <w:tcW w:w="3822" w:type="dxa"/>
           </w:tcPr>
           <w:p>
@@ -2192,7 +2036,6 @@
         </w:tc>
       </w:tr>
     </w:tbl>
-    <w:p/>
     <w:p>
       <w:pPr>
         <w:pStyle w:val="Kop4"/>
@@ -2271,6 +2114,7 @@
     <w:p>
       <w:pPr>
         <w:pStyle w:val="Kop3"/>
+        <w:spacing w:after="360"/>
       </w:pPr>
       <w:bookmarkStart w:id="6" w:name="_Toc223874295"/>
       <w:r>
@@ -5352,7 +5196,7 @@
       </w:pPr>
       <w:bookmarkStart w:id="7" w:name="_Toc223874296"/>
       <w:r>
-        <w:t>Onderzoek scores</w:t>
+        <w:t>Onderzoeksscores</w:t>
       </w:r>
       <w:bookmarkEnd w:id="7"/>
     </w:p>
@@ -6370,11 +6214,17 @@
       <w:pPr>
         <w:pStyle w:val="Kop2"/>
       </w:pPr>
-      <w:bookmarkStart w:id="8" w:name="_Toc223874297"/>
       <w:r>
         <w:t>Bevindingen</w:t>
       </w:r>
-      <w:bookmarkEnd w:id="8"/>
+    </w:p>
+    <w:p w14:paraId="CRI00001">
+      <w:pPr>
+        <w:pStyle w:val="Kop3"/>
+      </w:pPr>
+      <w:r>
+        <w:t>1.3.3 Zintuiglijke eigenschappen A</w:t>
+      </w:r>
     </w:p>
     <w:p>
       <w:r>
@@ -6545,6 +6395,7 @@
     </w:p>
     <w:p>
       <w:pPr>
+        <w:pageBreakBefore/>
         <w:pStyle w:val="Kop2"/>
       </w:pPr>
       <w:bookmarkStart w:id="10" w:name="_Toc223874299"/>
@@ -8710,8 +8561,8 @@
     <w:rPr>
       <w:rFonts w:ascii="Brockmann" w:eastAsia="Times New Roman" w:hAnsi="Brockmann"/>
       <w:color w:val="290047"/>
-      <w:sz w:val="32"/>
-      <w:szCs w:val="32"/>
+      <w:sz w:val="40"/>
+      <w:szCs w:val="40"/>
     </w:rPr>
   </w:style>
   <w:style w:type="paragraph" w:styleId="Kop3">
@@ -8728,6 +8579,8 @@
       <w:outlineLvl w:val="2"/>
     </w:pPr>
     <w:rPr>
+      <w:sz w:val="32"/>
+      <w:szCs w:val="32"/>
       <w:rFonts w:eastAsia="Times New Roman"/>
       <w:b/>
       <w:bCs/>
@@ -8749,10 +8602,11 @@
       <w:outlineLvl w:val="3"/>
     </w:pPr>
     <w:rPr>
+      <w:b/>
+      <w:bCs/>
       <w:rFonts w:ascii="Brockmann" w:eastAsia="Times New Roman" w:hAnsi="Brockmann"/>
-      <w:b/>
       <w:iCs/>
-      <w:sz w:val="22"/>
+      <w:sz w:val="28"/>
     </w:rPr>
   </w:style>
   <w:style w:type="paragraph" w:styleId="Kop5">
@@ -8770,9 +8624,11 @@
       <w:outlineLvl w:val="4"/>
     </w:pPr>
     <w:rPr>
+      <w:b/>
+      <w:bCs/>
       <w:rFonts w:ascii="Brockmann" w:eastAsia="Times New Roman" w:hAnsi="Brockmann"/>
-      <w:color w:val="7030A0"/>
-      <w:sz w:val="20"/>
+      <w:color w:val="000000"/>
+      <w:sz w:val="24"/>
     </w:rPr>
   </w:style>
   <w:style w:type="paragraph" w:styleId="Kop6">
@@ -9193,7 +9049,7 @@
     <w:rsid w:val="00B65DDF"/>
     <w:pPr>
       <w:spacing w:after="100"/>
-      <w:ind w:left="240"/>
+      <w:ind w:left="0"/>
     </w:pPr>
   </w:style>
   <w:style w:type="paragraph" w:styleId="Inhopg3">
@@ -9206,7 +9062,7 @@
     <w:rsid w:val="00B65DDF"/>
     <w:pPr>
       <w:spacing w:after="100"/>
-      <w:ind w:left="480"/>
+      <w:ind w:left="0"/>
     </w:pPr>
   </w:style>
 </w:styles>

</xml_diff>

<commit_message>
feat: Add database backup and Word template improvements
- Database backup (2026-03-14-21-04-51): 9 projects, 2600 crawler results
- Word template: Changed "Formulieren:" to "Website:" label
- Word template: Font sizes adjusted to 12pt for consistency
- Fixed uniqueForms calculation to count in-scope URLs correctly
- Removed "gemeente" prefix removal from opdrachtgever naam

🤖 Generated with [Claude Code](https://claude.com/claude-code)

Co-Authored-By: Claude <noreply@anthropic.com>
</commit_message>
<xml_diff>
--- a/templates/formulieren/Toegankelijkheidsonderzoek formulieren Template - with placeholders.docx
+++ b/templates/formulieren/Toegankelijkheidsonderzoek formulieren Template - with placeholders.docx
@@ -164,7 +164,7 @@
           <w:sz w:val="22"/>
           <w:szCs w:val="22"/>
         </w:rPr>
-        <w:t>Formulieren</w:t>
+        <w:t>Website</w:t>
       </w:r>
       <w:r>
         <w:rPr>
@@ -7519,7 +7519,7 @@
       </w:pPr>
       <w:rPr>
         <w:rFonts w:ascii="Symbol" w:hAnsi="Symbol" w:hint="default"/>
-        <w:sz w:val="20"/>
+        <w:sz w:val="24"/>
       </w:rPr>
     </w:lvl>
     <w:lvl w:ilvl="1" w:tentative="1">
@@ -7535,7 +7535,7 @@
       </w:pPr>
       <w:rPr>
         <w:rFonts w:ascii="Courier New" w:hAnsi="Courier New" w:hint="default"/>
-        <w:sz w:val="20"/>
+        <w:sz w:val="24"/>
       </w:rPr>
     </w:lvl>
     <w:lvl w:ilvl="2" w:tentative="1">
@@ -7551,7 +7551,7 @@
       </w:pPr>
       <w:rPr>
         <w:rFonts w:ascii="Wingdings" w:hAnsi="Wingdings" w:hint="default"/>
-        <w:sz w:val="20"/>
+        <w:sz w:val="24"/>
       </w:rPr>
     </w:lvl>
     <w:lvl w:ilvl="3" w:tentative="1">
@@ -7567,7 +7567,7 @@
       </w:pPr>
       <w:rPr>
         <w:rFonts w:ascii="Wingdings" w:hAnsi="Wingdings" w:hint="default"/>
-        <w:sz w:val="20"/>
+        <w:sz w:val="24"/>
       </w:rPr>
     </w:lvl>
     <w:lvl w:ilvl="4" w:tentative="1">
@@ -7583,7 +7583,7 @@
       </w:pPr>
       <w:rPr>
         <w:rFonts w:ascii="Wingdings" w:hAnsi="Wingdings" w:hint="default"/>
-        <w:sz w:val="20"/>
+        <w:sz w:val="24"/>
       </w:rPr>
     </w:lvl>
     <w:lvl w:ilvl="5" w:tentative="1">
@@ -7599,7 +7599,7 @@
       </w:pPr>
       <w:rPr>
         <w:rFonts w:ascii="Wingdings" w:hAnsi="Wingdings" w:hint="default"/>
-        <w:sz w:val="20"/>
+        <w:sz w:val="24"/>
       </w:rPr>
     </w:lvl>
     <w:lvl w:ilvl="6" w:tentative="1">
@@ -7615,7 +7615,7 @@
       </w:pPr>
       <w:rPr>
         <w:rFonts w:ascii="Wingdings" w:hAnsi="Wingdings" w:hint="default"/>
-        <w:sz w:val="20"/>
+        <w:sz w:val="24"/>
       </w:rPr>
     </w:lvl>
     <w:lvl w:ilvl="7" w:tentative="1">
@@ -7631,7 +7631,7 @@
       </w:pPr>
       <w:rPr>
         <w:rFonts w:ascii="Wingdings" w:hAnsi="Wingdings" w:hint="default"/>
-        <w:sz w:val="20"/>
+        <w:sz w:val="24"/>
       </w:rPr>
     </w:lvl>
     <w:lvl w:ilvl="8" w:tentative="1">
@@ -7647,7 +7647,7 @@
       </w:pPr>
       <w:rPr>
         <w:rFonts w:ascii="Wingdings" w:hAnsi="Wingdings" w:hint="default"/>
-        <w:sz w:val="20"/>
+        <w:sz w:val="24"/>
       </w:rPr>
     </w:lvl>
   </w:abstractNum>
@@ -7668,7 +7668,7 @@
       </w:pPr>
       <w:rPr>
         <w:rFonts w:ascii="Symbol" w:hAnsi="Symbol" w:hint="default"/>
-        <w:sz w:val="20"/>
+        <w:sz w:val="24"/>
       </w:rPr>
     </w:lvl>
     <w:lvl w:ilvl="1" w:tentative="1">
@@ -7684,7 +7684,7 @@
       </w:pPr>
       <w:rPr>
         <w:rFonts w:ascii="Courier New" w:hAnsi="Courier New" w:hint="default"/>
-        <w:sz w:val="20"/>
+        <w:sz w:val="24"/>
       </w:rPr>
     </w:lvl>
     <w:lvl w:ilvl="2" w:tentative="1">
@@ -7700,7 +7700,7 @@
       </w:pPr>
       <w:rPr>
         <w:rFonts w:ascii="Wingdings" w:hAnsi="Wingdings" w:hint="default"/>
-        <w:sz w:val="20"/>
+        <w:sz w:val="24"/>
       </w:rPr>
     </w:lvl>
     <w:lvl w:ilvl="3" w:tentative="1">
@@ -7716,7 +7716,7 @@
       </w:pPr>
       <w:rPr>
         <w:rFonts w:ascii="Wingdings" w:hAnsi="Wingdings" w:hint="default"/>
-        <w:sz w:val="20"/>
+        <w:sz w:val="24"/>
       </w:rPr>
     </w:lvl>
     <w:lvl w:ilvl="4" w:tentative="1">
@@ -7732,7 +7732,7 @@
       </w:pPr>
       <w:rPr>
         <w:rFonts w:ascii="Wingdings" w:hAnsi="Wingdings" w:hint="default"/>
-        <w:sz w:val="20"/>
+        <w:sz w:val="24"/>
       </w:rPr>
     </w:lvl>
     <w:lvl w:ilvl="5" w:tentative="1">
@@ -7748,7 +7748,7 @@
       </w:pPr>
       <w:rPr>
         <w:rFonts w:ascii="Wingdings" w:hAnsi="Wingdings" w:hint="default"/>
-        <w:sz w:val="20"/>
+        <w:sz w:val="24"/>
       </w:rPr>
     </w:lvl>
     <w:lvl w:ilvl="6" w:tentative="1">
@@ -7764,7 +7764,7 @@
       </w:pPr>
       <w:rPr>
         <w:rFonts w:ascii="Wingdings" w:hAnsi="Wingdings" w:hint="default"/>
-        <w:sz w:val="20"/>
+        <w:sz w:val="24"/>
       </w:rPr>
     </w:lvl>
     <w:lvl w:ilvl="7" w:tentative="1">
@@ -7780,7 +7780,7 @@
       </w:pPr>
       <w:rPr>
         <w:rFonts w:ascii="Wingdings" w:hAnsi="Wingdings" w:hint="default"/>
-        <w:sz w:val="20"/>
+        <w:sz w:val="24"/>
       </w:rPr>
     </w:lvl>
     <w:lvl w:ilvl="8" w:tentative="1">
@@ -7796,7 +7796,7 @@
       </w:pPr>
       <w:rPr>
         <w:rFonts w:ascii="Wingdings" w:hAnsi="Wingdings" w:hint="default"/>
-        <w:sz w:val="20"/>
+        <w:sz w:val="24"/>
       </w:rPr>
     </w:lvl>
   </w:abstractNum>

</xml_diff>

<commit_message>
feat: Add light green background for external projects and database backup
- Changed external project row background from blue to green (bg-green-50)
- Added database backup (3,136 records across 14 tables)
- Added Word template backup
- Includes previous features: settings table, planning fields, external project tracking, and reinspection date

🤖 Generated with [Claude Code](https://claude.com/claude-code)

Co-Authored-By: Claude <noreply@anthropic.com>
</commit_message>
<xml_diff>
--- a/templates/formulieren/Toegankelijkheidsonderzoek formulieren Template - with placeholders.docx
+++ b/templates/formulieren/Toegankelijkheidsonderzoek formulieren Template - with placeholders.docx
@@ -94,27 +94,7 @@
         <w:spacing w:before="720"/>
       </w:pPr>
       <w:r>
-        <w:t xml:space="preserve">Dit rapport beschrijft de resultaten van het deelonderzoek naar de toegankelijkheid van </w:t>
-      </w:r>
-      <w:r>
-        <w:t>de content van de formulieren</w:t>
-      </w:r>
-      <w:r>
-        <w:t xml:space="preserve"> op</w:t>
-      </w:r>
-      <w:r>
-        <w:t xml:space="preserve"> </w:t>
-      </w:r>
-      <w:hyperlink r:id="rId9" w:history="1">
-        <w:r>
-          <w:rPr>
-            <w:rStyle w:val="Hyperlink"/>
-          </w:rPr>
-          <w:t>{websiteUrl}</w:t>
-        </w:r>
-      </w:hyperlink>
-      <w:r>
-        <w:t> </w:t>
+        <w:t xml:space="preserve">{reportIntroHeader}</w:t>
       </w:r>
       <w:r>
         <w:br/>
@@ -6546,7 +6526,7 @@
         <w:spacing w:line="276" w:lineRule="auto"/>
       </w:pPr>
       <w:r>
-        <w:t>Omdat het onderzoek is uitgevoerd op basis van een steekproef, kunnen vergelijkbare afwijkingen ook voorkomen in formulieren die niet zijn onderzocht. Het is daarom raadzaam om alle formulieren te controleren op vergelijkbare patronen en deze structureel te monitoren.</w:t>
+        <w:t>Omdat het onderzoek is uitgevoerd op basis van een steekproef, kunnen vergelijkbare afwijkingen ook voorkomen in formulieren die niet zijn onderzocht. Het is daarom raadzaam om alle online formulieren te controleren op vergelijkbare patronen en deze structureel te monitoren.</w:t>
       </w:r>
     </w:p>
     <w:p>
@@ -6555,7 +6535,7 @@
         <w:spacing w:line="276" w:lineRule="auto"/>
       </w:pPr>
       <w:r>
-        <w:t>Daarnaast kunnen wijzigingen in de inhoud van formulieren of in het publicatieproces nieuwe toegankelijkheidsrisico's met zich meebrengen. Structurele aandacht voor toegankelijkheid en periodieke herbeoordeling van de formulieren blijven daarom noodzakelijk.</w:t>
+        <w:t>Daarnaast kunnen wijzigingen in de content van formulieren of in het publicatieproces nieuwe toegankelijkheidsrisico's met zich meebrengen. Structurele aandacht voor toegankelijkheid en periodieke herbeoordeling van de formulieren blijven daarom noodzakelijk.</w:t>
       </w:r>
     </w:p>
     <w:p>

</xml_diff>

<commit_message>
fix: Update report text for website vs formulieren context
- Added {standard} and {level} placeholder replacements in summary template
- Updated borging section text to be context-appropriate (website vs formulieren)
- Updated formulieren Word template
- Minor whitespace cleanup in onderzoeken page

🤖 Generated with [Claude Code](https://claude.com/claude-code)

Co-Authored-By: Claude <noreply@anthropic.com>
</commit_message>
<xml_diff>
--- a/templates/formulieren/Toegankelijkheidsonderzoek formulieren Template - with placeholders.docx
+++ b/templates/formulieren/Toegankelijkheidsonderzoek formulieren Template - with placeholders.docx
@@ -80,7 +80,7 @@
           <w:sz w:val="28"/>
           <w:szCs w:val="28"/>
         </w:rPr>
-        <w:t xml:space="preserve"> gemeente Wierden</w:t>
+        <w:t xml:space="preserve"> gemeente {projectSubject}</w:t>
       </w:r>
       <w:bookmarkEnd w:id="0"/>
     </w:p>
@@ -94,7 +94,7 @@
         <w:spacing w:before="720"/>
       </w:pPr>
       <w:r>
-        <w:t xml:space="preserve">Dit rapport beschrijft de resultaten van het deelonderzoek naar de toegankelijkheid van de content van de formulieren op wierden.nl</w:t>
+        <w:t xml:space="preserve">Dit rapport beschrijft de resultaten van het deelonderzoek naar de toegankelijkheid van de content van de formulieren op {websiteUrl}</w:t>
       </w:r>
       <w:r>
         <w:br/>
@@ -130,7 +130,7 @@
           <w:sz w:val="22"/>
           <w:szCs w:val="22"/>
         </w:rPr>
-        <w:t xml:space="preserve"> gemeente Wierden</w:t>
+        <w:t xml:space="preserve"> gemeente {projectSubject}</w:t>
       </w:r>
     </w:p>
     <w:p>
@@ -169,7 +169,7 @@
             <w:sz w:val="22"/>
             <w:szCs w:val="22"/>
           </w:rPr>
-          <w:t xml:space="preserve">wierden.nl</w:t>
+          <w:t xml:space="preserve">{websiteUrl}</w:t>
         </w:r>
       </w:hyperlink>
     </w:p>
@@ -192,7 +192,7 @@
           <w:sz w:val="22"/>
           <w:szCs w:val="22"/>
         </w:rPr>
-        <w:t>1.0</w:t>
+        <w:t>{version}</w:t>
       </w:r>
     </w:p>
     <w:p>
@@ -772,12 +772,12 @@
         <w:pageBreakBefore/>
         <w:pStyle w:val="Kop2"/>
       </w:pPr>
-      <w:bookmarkStart w:id="0" w:name="_Toc_Samenvatting"/>
+      <w:bookmarkStart w:id="2" w:name="_Toc223874291"/>
       <w:r>
         <w:lastRenderedPageBreak/>
         <w:t>Samenvatting</w:t>
       </w:r>
-      <w:bookmarkEnd w:id="0"/>
+      <w:bookmarkEnd w:id="2"/>
     </w:p>
     <w:p>
       <w:pPr>
@@ -836,7 +836,6 @@
       </w:r>
     </w:p>
     <w:p>
-      <w:bookmarkStart w:id="1" w:name="_Toc_OverDitOnderzoek"/>
       <w:pPr>
         <w:pStyle w:val="Kop2"/>
       </w:pPr>
@@ -844,7 +843,6 @@
         <w:t>Over dit onderzoek</w:t>
       </w:r>
       <w:bookmarkEnd w:id="3"/>
-      <w:bookmarkEnd w:id="1"/>
     </w:p>
     <w:p>
       <w:r>
@@ -1402,12 +1400,12 @@
       <w:pPr>
         <w:pStyle w:val="Kop2"/>
       </w:pPr>
-      <w:bookmarkStart w:id="2" w:name="_Toc_OverzichtResultaten"/>
+      <w:bookmarkStart w:id="5" w:name="_Toc223874294"/>
       <w:r>
         <w:lastRenderedPageBreak/>
         <w:t>Overzicht resultaten</w:t>
       </w:r>
-      <w:bookmarkEnd w:id="2"/>
+      <w:bookmarkEnd w:id="5"/>
     </w:p>
     <w:p>
       <w:r>
@@ -5784,7 +5782,6 @@
     </w:tbl>
     <w:p/>
     <w:p>
-      <w:bookmarkStart w:id="3" w:name="_Toc_Bevindingen"/>
       <w:pPr>
         <w:pageBreakBefore/>
         <w:pStyle w:val="Kop2"/>
@@ -5792,7 +5789,6 @@
       <w:r>
         <w:t>Bevindingen</w:t>
       </w:r>
-      <w:bookmarkEnd w:id="3"/>
     </w:p>
     <w:p>
       <w:pPr/>
@@ -5881,7 +5877,7 @@
         <w:rPr>
           <w:rStyle w:val="Hyperlink"/>
         </w:rPr>
-        <w:t>https://www.wierden.nl/form/reactieformulier-vernieuwing-speelplek-de-stouwe-europaring-oostzijde/reactieformulier-vernieuwing-speelplek-de-stouwe-europaring-oostzijde-0</w:t>
+        <w:t>https://www.{websiteUrl}/form/reactieformulier-vernieuwing-speelplek-de-stouwe-europaring-oostzijde/reactieformulier-vernieuwing-speelplek-de-stouwe-europaring-oostzijde-0</w:t>
       </w:r>
     </w:p>
     <w:p>
@@ -5896,7 +5892,7 @@
         <w:rPr>
           <w:rStyle w:val="Hyperlink"/>
         </w:rPr>
-        <w:t>https://www.wierden.nl/form/aanmelden-updates-zenderink/gegevens-0-1</w:t>
+        <w:t>https://www.{websiteUrl}/form/aanmelden-updates-zenderink/gegevens-0-1</w:t>
       </w:r>
     </w:p>
     <w:p>
@@ -5944,7 +5940,7 @@
         <w:rPr>
           <w:rStyle w:val="Hyperlink"/>
         </w:rPr>
-        <w:t>https://www.wierden.nl/form/reactieformulier-vernieuwing-speelplek-de-stouwe-europaring-oostzijde/reactieformulier-vernieuwing-speelplek-de-stouwe-europaring-oostzijde-0</w:t>
+        <w:t>https://www.{websiteUrl}/form/reactieformulier-vernieuwing-speelplek-de-stouwe-europaring-oostzijde/reactieformulier-vernieuwing-speelplek-de-stouwe-europaring-oostzijde-0</w:t>
       </w:r>
     </w:p>
     <w:p>
@@ -5959,7 +5955,7 @@
         <w:rPr>
           <w:rStyle w:val="Hyperlink"/>
         </w:rPr>
-        <w:t>https://www.wierden.nl/form/aanmelden-updates-zenderink/gegevens-0-1</w:t>
+        <w:t>https://www.{websiteUrl}/form/aanmelden-updates-zenderink/gegevens-0-1</w:t>
       </w:r>
     </w:p>
     <w:p>
@@ -6007,7 +6003,7 @@
         <w:rPr>
           <w:rStyle w:val="Hyperlink"/>
         </w:rPr>
-        <w:t>https://www.wierden.nl/form/contactformulier-trouwambtenaar-bert-groothengel/contactformulier-trouwambtenaar-bert-groothengel-0</w:t>
+        <w:t>https://www.{websiteUrl}/form/contactformulier-trouwambtenaar-bert-groothengel/contactformulier-trouwambtenaar-bert-groothengel-0</w:t>
       </w:r>
     </w:p>
     <w:p>
@@ -6111,7 +6107,7 @@
         <w:rPr>
           <w:rStyle w:val="Hyperlink"/>
         </w:rPr>
-        <w:t>https://www.wierden.nl/form/reactieformulier-vernieuwing-speelplek-de-stouwe-europaring-oostzijde/reactieformulier-vernieuwing-speelplek-de-stouwe-europaring-oostzijde-0</w:t>
+        <w:t>https://www.{websiteUrl}/form/reactieformulier-vernieuwing-speelplek-de-stouwe-europaring-oostzijde/reactieformulier-vernieuwing-speelplek-de-stouwe-europaring-oostzijde-0</w:t>
       </w:r>
     </w:p>
     <w:p>
@@ -6126,7 +6122,7 @@
         <w:rPr>
           <w:rStyle w:val="Hyperlink"/>
         </w:rPr>
-        <w:t>https://www.wierden.nl/form/contactformulier-trouwambtenaar-bert-groothengel/contactformulier-trouwambtenaar-bert-groothengel-0</w:t>
+        <w:t>https://www.{websiteUrl}/form/contactformulier-trouwambtenaar-bert-groothengel/contactformulier-trouwambtenaar-bert-groothengel-0</w:t>
       </w:r>
     </w:p>
     <w:p>
@@ -6230,7 +6226,7 @@
         <w:rPr>
           <w:rStyle w:val="Hyperlink"/>
         </w:rPr>
-        <w:t>https://www.wierden.nl/form/aanmelden-updates-zenderink/gegevens-0-1</w:t>
+        <w:t>https://www.{websiteUrl}/form/aanmelden-updates-zenderink/gegevens-0-1</w:t>
       </w:r>
     </w:p>
     <w:p>
@@ -6278,7 +6274,7 @@
         <w:rPr>
           <w:rStyle w:val="Hyperlink"/>
         </w:rPr>
-        <w:t>https://www.wierden.nl/form/contactformulier-trouwambtenaar-bert-groothengel/contactformulier-trouwambtenaar-bert-groothengel-0</w:t>
+        <w:t>https://www.{websiteUrl}/form/contactformulier-trouwambtenaar-bert-groothengel/contactformulier-trouwambtenaar-bert-groothengel-0</w:t>
       </w:r>
     </w:p>
     <w:p>
@@ -6382,7 +6378,7 @@
         <w:rPr>
           <w:rStyle w:val="Hyperlink"/>
         </w:rPr>
-        <w:t>https://www.wierden.nl/form/contactformulier-trouwambtenaar-bert-groothengel/contactformulier-trouwambtenaar-bert-groothengel-0</w:t>
+        <w:t>https://www.{websiteUrl}/form/contactformulier-trouwambtenaar-bert-groothengel/contactformulier-trouwambtenaar-bert-groothengel-0</w:t>
       </w:r>
     </w:p>
     <w:p>
@@ -6406,7 +6402,6 @@
       </w:r>
     </w:p>
     <w:p>
-      <w:bookmarkStart w:id="4" w:name="_Toc_Opmerkingen"/>
       <w:pPr>
         <w:pageBreakBefore/>
         <w:pStyle w:val="Kop2"/>
@@ -6414,7 +6409,6 @@
       <w:r>
         <w:t>Opmerkingen</w:t>
       </w:r>
-      <w:bookmarkEnd w:id="4"/>
     </w:p>
     <w:p>
       <w:pPr/>
@@ -6503,7 +6497,7 @@
         <w:rPr>
           <w:rStyle w:val="Hyperlink"/>
         </w:rPr>
-        <w:t>https://www.wierden.nl/form/reactieformulier-vernieuwing-speelplek-de-stouwe-europaring-oostzijde/reactieformulier-vernieuwing-speelplek-de-stouwe-europaring-oostzijde-0</w:t>
+        <w:t>https://www.{websiteUrl}/form/reactieformulier-vernieuwing-speelplek-de-stouwe-europaring-oostzijde/reactieformulier-vernieuwing-speelplek-de-stouwe-europaring-oostzijde-0</w:t>
       </w:r>
     </w:p>
     <w:p>
@@ -6518,7 +6512,7 @@
         <w:rPr>
           <w:rStyle w:val="Hyperlink"/>
         </w:rPr>
-        <w:t>https://www.wierden.nl/form/reactieformulier-vernieuwing-speelplek-de-stouwe-europaring-oostzijde/overzicht-1</w:t>
+        <w:t>https://www.{websiteUrl}/form/reactieformulier-vernieuwing-speelplek-de-stouwe-europaring-oostzijde/overzicht-1</w:t>
       </w:r>
     </w:p>
     <w:p>
@@ -6730,11 +6724,11 @@
       <w:pPr>
         <w:pStyle w:val="Kop2"/>
       </w:pPr>
-      <w:bookmarkStart w:id="5" w:name="_Toc_BorgingEnVervolg"/>
+      <w:bookmarkStart w:id="12" w:name="_Toc223874301"/>
       <w:r>
         <w:t>Borging en vervolg</w:t>
       </w:r>
-      <w:bookmarkEnd w:id="5"/>
+      <w:bookmarkEnd w:id="12"/>
     </w:p>
     <w:p>
       <w:pPr>
@@ -6773,13 +6767,13 @@
       <w:pPr>
         <w:pStyle w:val="Kop2"/>
       </w:pPr>
-      <w:bookmarkStart w:id="6" w:name="_Toc_Onderzoeksdetails"/>
+      <w:bookmarkStart w:id="13" w:name="_Toc223874302"/>
       <w:proofErr w:type="spellStart"/>
       <w:r>
         <w:lastRenderedPageBreak/>
         <w:t>Onderzoeksdetails</w:t>
       </w:r>
-      <w:bookmarkEnd w:id="6"/>
+      <w:bookmarkEnd w:id="13"/>
       <w:proofErr w:type="spellEnd"/>
     </w:p>
     <w:p>
@@ -6827,7 +6821,7 @@
           <w:rPr>
             <w:rStyle w:val="Hyperlink"/>
           </w:rPr>
-          <w:t>https://www.wierden.nl/form/aanmelden-updates-zenderink/gegevens-0-1</w:t>
+          <w:t>https://www.{websiteUrl}/form/aanmelden-updates-zenderink/gegevens-0-1</w:t>
         </w:r>
       </w:hyperlink>
     </w:p>
@@ -6840,7 +6834,7 @@
           <w:rPr>
             <w:rStyle w:val="Hyperlink"/>
           </w:rPr>
-          <w:t>https://www.wierden.nl/form/contactformulier-trouwambtenaar-bert-groothengel/contactformulier-trouwambtenaar-bert-groothengel-0</w:t>
+          <w:t>https://www.{websiteUrl}/form/contactformulier-trouwambtenaar-bert-groothengel/contactformulier-trouwambtenaar-bert-groothengel-0</w:t>
         </w:r>
       </w:hyperlink>
     </w:p>
@@ -6853,7 +6847,7 @@
           <w:rPr>
             <w:rStyle w:val="Hyperlink"/>
           </w:rPr>
-          <w:t>https://www.wierden.nl/form/reactieformulier-vernieuwing-speelplek-de-stouwe-europaring-oostzijde/reactieformulier-vernieuwing-speelplek-de-stouwe-europaring-oostzijde-0</w:t>
+          <w:t>https://www.{websiteUrl}/form/reactieformulier-vernieuwing-speelplek-de-stouwe-europaring-oostzijde/reactieformulier-vernieuwing-speelplek-de-stouwe-europaring-oostzijde-0</w:t>
         </w:r>
       </w:hyperlink>
     </w:p>
@@ -6900,10 +6894,6 @@
         </w:numPr>
       </w:pPr>
       <w:r>
-        <w:rPr>
-          <w:b/>
-          <w:bCs/>
-        </w:rPr>
         <w:t>Stap 1 - Reactieformulier Vernieuwing Speelplek De Stouwe Europaring Oostzijde</w:t>
       </w:r>
       <w:r>
@@ -6913,7 +6903,7 @@
         <w:rPr>
           <w:rStyle w:val="Hyperlink"/>
         </w:rPr>
-        <w:t>https://www.wierden.nl/form/reactieformulier-vernieuwing-speelplek-de-stouwe-europaring-oostzijde/reactieformulier-vernieuwing-speelplek-de-stouwe-europaring-oostzijde-0</w:t>
+        <w:t>https://www.{websiteUrl}/form/reactieformulier-vernieuwing-speelplek-de-stouwe-europaring-oostzijde/reactieformulier-vernieuwing-speelplek-de-stouwe-europaring-oostzijde-0</w:t>
       </w:r>
     </w:p>
     <w:p>
@@ -6924,10 +6914,6 @@
         </w:numPr>
       </w:pPr>
       <w:r>
-        <w:rPr>
-          <w:b/>
-          <w:bCs/>
-        </w:rPr>
         <w:t>Stap 2 - Controleren (Reactieformulier)</w:t>
       </w:r>
       <w:r>
@@ -6937,7 +6923,7 @@
         <w:rPr>
           <w:rStyle w:val="Hyperlink"/>
         </w:rPr>
-        <w:t>https://www.wierden.nl/form/reactieformulier-vernieuwing-speelplek-de-stouwe-europaring-oostzijde/overzicht-1</w:t>
+        <w:t>https://www.{websiteUrl}/form/reactieformulier-vernieuwing-speelplek-de-stouwe-europaring-oostzijde/overzicht-1</w:t>
       </w:r>
     </w:p>
     <w:p>
@@ -6948,10 +6934,6 @@
         </w:numPr>
       </w:pPr>
       <w:r>
-        <w:rPr>
-          <w:b/>
-          <w:bCs/>
-        </w:rPr>
         <w:t>Stap3 -voltooid (reactieformulier)</w:t>
       </w:r>
       <w:r>
@@ -6961,7 +6943,7 @@
         <w:rPr>
           <w:rStyle w:val="Hyperlink"/>
         </w:rPr>
-        <w:t>https://www.wierden.nl/form/reactieformulier-vernieuwing-speelplek-de-stouwe-europaring-oostzijde/voltooid</w:t>
+        <w:t>https://www.{websiteUrl}/form/reactieformulier-vernieuwing-speelplek-de-stouwe-europaring-oostzijde/voltooid</w:t>
       </w:r>
     </w:p>
     <w:p>
@@ -6972,10 +6954,6 @@
         </w:numPr>
       </w:pPr>
       <w:r>
-        <w:rPr>
-          <w:b/>
-          <w:bCs/>
-        </w:rPr>
         <w:t>Stap 1 - Gegevens (Aanmelden updates Zenderink)</w:t>
       </w:r>
       <w:r>
@@ -6985,7 +6963,7 @@
         <w:rPr>
           <w:rStyle w:val="Hyperlink"/>
         </w:rPr>
-        <w:t>https://www.wierden.nl/form/aanmelden-updates-zenderink/gegevens-0-1</w:t>
+        <w:t>https://www.{websiteUrl}/form/aanmelden-updates-zenderink/gegevens-0-1</w:t>
       </w:r>
     </w:p>
     <w:p>
@@ -6996,10 +6974,6 @@
         </w:numPr>
       </w:pPr>
       <w:r>
-        <w:rPr>
-          <w:b/>
-          <w:bCs/>
-        </w:rPr>
         <w:t>Stap 2 - Controleren (Aanmelden updates Zenderink)</w:t>
       </w:r>
       <w:r>
@@ -7009,7 +6983,7 @@
         <w:rPr>
           <w:rStyle w:val="Hyperlink"/>
         </w:rPr>
-        <w:t>https://www.wierden.nl/form/aanmelden-updates-zenderink/overzicht-1</w:t>
+        <w:t>https://www.{websiteUrl}/form/aanmelden-updates-zenderink/overzicht-1</w:t>
       </w:r>
     </w:p>
     <w:p>
@@ -7020,10 +6994,6 @@
         </w:numPr>
       </w:pPr>
       <w:r>
-        <w:rPr>
-          <w:b/>
-          <w:bCs/>
-        </w:rPr>
         <w:t>Stap 3 - Voltooid (Aanmelden updates Zenderink)</w:t>
       </w:r>
       <w:r>
@@ -7033,7 +7003,7 @@
         <w:rPr>
           <w:rStyle w:val="Hyperlink"/>
         </w:rPr>
-        <w:t>https://www.wierden.nl/form/aanmelden-updates-zenderink/voltooid</w:t>
+        <w:t>https://www.{websiteUrl}/form/aanmelden-updates-zenderink/voltooid</w:t>
       </w:r>
     </w:p>
     <w:p>
@@ -7044,10 +7014,6 @@
         </w:numPr>
       </w:pPr>
       <w:r>
-        <w:rPr>
-          <w:b/>
-          <w:bCs/>
-        </w:rPr>
         <w:t>Stap 1 - Contactformulier-trouwambtenaar-bert-groothengel/contactformulier-trouwambtenaar-bert-groothengel</w:t>
       </w:r>
       <w:r>
@@ -7057,7 +7023,7 @@
         <w:rPr>
           <w:rStyle w:val="Hyperlink"/>
         </w:rPr>
-        <w:t>https://www.wierden.nl/form/contactformulier-trouwambtenaar-bert-groothengel/contactformulier-trouwambtenaar-bert-groothengel-0</w:t>
+        <w:t>https://www.{websiteUrl}/form/contactformulier-trouwambtenaar-bert-groothengel/contactformulier-trouwambtenaar-bert-groothengel-0</w:t>
       </w:r>
     </w:p>
     <w:p>
@@ -7068,10 +7034,6 @@
         </w:numPr>
       </w:pPr>
       <w:r>
-        <w:rPr>
-          <w:b/>
-          <w:bCs/>
-        </w:rPr>
         <w:t>Stap 2 - Controleren (Contactformulier trouwambtenaar)</w:t>
       </w:r>
       <w:r>
@@ -7081,7 +7043,7 @@
         <w:rPr>
           <w:rStyle w:val="Hyperlink"/>
         </w:rPr>
-        <w:t>https://www.wierden.nl/form/contactformulier-trouwambtenaar-bert-groothengel/overzicht-1</w:t>
+        <w:t>https://www.{websiteUrl}/form/contactformulier-trouwambtenaar-bert-groothengel/overzicht-1</w:t>
       </w:r>
     </w:p>
     <w:p>
@@ -7092,10 +7054,6 @@
         </w:numPr>
       </w:pPr>
       <w:r>
-        <w:rPr>
-          <w:b/>
-          <w:bCs/>
-        </w:rPr>
         <w:t>Stap 3 - Voltooid (Contactformulier trouwambtenaar)</w:t>
       </w:r>
       <w:r>
@@ -7105,7 +7063,7 @@
         <w:rPr>
           <w:rStyle w:val="Hyperlink"/>
         </w:rPr>
-        <w:t>https://www.wierden.nl/form/contactformulier-trouwambtenaar-bert-groothengel/voltooid</w:t>
+        <w:t>https://www.{websiteUrl}/form/contactformulier-trouwambtenaar-bert-groothengel/voltooid</w:t>
       </w:r>
     </w:p>
     <w:p>
@@ -7335,17 +7293,16 @@
     <w:tmpl w:val="AD12F874"/>
     <w:lvl w:ilvl="0">
       <w:start w:val="1"/>
-      <w:numFmt w:val="bullet"/>
-      <w:lvlText w:val="·"/>
+      <w:numFmt w:val="none"/>
+      <w:lvlText w:val=""/>
       <w:lvlJc w:val="left"/>
       <w:pPr>
         <w:tabs>
           <w:tab w:val="num" w:pos="720"/>
         </w:tabs>
-        <w:ind w:left="720" w:hanging="360"/>
+        <w:ind w:left="0" w:hanging="0"/>
       </w:pPr>
       <w:rPr>
-        <w:rFonts w:ascii="Symbol" w:hAnsi="Symbol" w:hint="default"/>
         <w:sz w:val="20"/>
       </w:rPr>
     </w:lvl>
@@ -7368,7 +7325,7 @@
     <w:lvl w:ilvl="2" w:tentative="1">
       <w:start w:val="1"/>
       <w:numFmt w:val="bullet"/>
-      <w:lvlText w:val="·"/>
+      <w:lvlText w:val=""/>
       <w:lvlJc w:val="left"/>
       <w:pPr>
         <w:tabs>
@@ -7384,7 +7341,7 @@
     <w:lvl w:ilvl="3" w:tentative="1">
       <w:start w:val="1"/>
       <w:numFmt w:val="bullet"/>
-      <w:lvlText w:val="·"/>
+      <w:lvlText w:val=""/>
       <w:lvlJc w:val="left"/>
       <w:pPr>
         <w:tabs>
@@ -7400,7 +7357,7 @@
     <w:lvl w:ilvl="4" w:tentative="1">
       <w:start w:val="1"/>
       <w:numFmt w:val="bullet"/>
-      <w:lvlText w:val="·"/>
+      <w:lvlText w:val=""/>
       <w:lvlJc w:val="left"/>
       <w:pPr>
         <w:tabs>
@@ -7416,7 +7373,7 @@
     <w:lvl w:ilvl="5" w:tentative="1">
       <w:start w:val="1"/>
       <w:numFmt w:val="bullet"/>
-      <w:lvlText w:val="·"/>
+      <w:lvlText w:val=""/>
       <w:lvlJc w:val="left"/>
       <w:pPr>
         <w:tabs>
@@ -7432,7 +7389,7 @@
     <w:lvl w:ilvl="6" w:tentative="1">
       <w:start w:val="1"/>
       <w:numFmt w:val="bullet"/>
-      <w:lvlText w:val="·"/>
+      <w:lvlText w:val=""/>
       <w:lvlJc w:val="left"/>
       <w:pPr>
         <w:tabs>
@@ -7448,7 +7405,7 @@
     <w:lvl w:ilvl="7" w:tentative="1">
       <w:start w:val="1"/>
       <w:numFmt w:val="bullet"/>
-      <w:lvlText w:val="·"/>
+      <w:lvlText w:val=""/>
       <w:lvlJc w:val="left"/>
       <w:pPr>
         <w:tabs>
@@ -7464,7 +7421,7 @@
     <w:lvl w:ilvl="8" w:tentative="1">
       <w:start w:val="1"/>
       <w:numFmt w:val="bullet"/>
-      <w:lvlText w:val="·"/>
+      <w:lvlText w:val=""/>
       <w:lvlJc w:val="left"/>
       <w:pPr>
         <w:tabs>
@@ -7517,7 +7474,7 @@
     <w:lvl w:ilvl="2" w:tentative="1">
       <w:start w:val="1"/>
       <w:numFmt w:val="bullet"/>
-      <w:lvlText w:val="·"/>
+      <w:lvlText w:val=""/>
       <w:lvlJc w:val="left"/>
       <w:pPr>
         <w:tabs>
@@ -7533,7 +7490,7 @@
     <w:lvl w:ilvl="3" w:tentative="1">
       <w:start w:val="1"/>
       <w:numFmt w:val="bullet"/>
-      <w:lvlText w:val="·"/>
+      <w:lvlText w:val=""/>
       <w:lvlJc w:val="left"/>
       <w:pPr>
         <w:tabs>
@@ -7549,7 +7506,7 @@
     <w:lvl w:ilvl="4" w:tentative="1">
       <w:start w:val="1"/>
       <w:numFmt w:val="bullet"/>
-      <w:lvlText w:val="·"/>
+      <w:lvlText w:val=""/>
       <w:lvlJc w:val="left"/>
       <w:pPr>
         <w:tabs>
@@ -7565,7 +7522,7 @@
     <w:lvl w:ilvl="5" w:tentative="1">
       <w:start w:val="1"/>
       <w:numFmt w:val="bullet"/>
-      <w:lvlText w:val="·"/>
+      <w:lvlText w:val=""/>
       <w:lvlJc w:val="left"/>
       <w:pPr>
         <w:tabs>
@@ -7581,7 +7538,7 @@
     <w:lvl w:ilvl="6" w:tentative="1">
       <w:start w:val="1"/>
       <w:numFmt w:val="bullet"/>
-      <w:lvlText w:val="·"/>
+      <w:lvlText w:val=""/>
       <w:lvlJc w:val="left"/>
       <w:pPr>
         <w:tabs>
@@ -7597,7 +7554,7 @@
     <w:lvl w:ilvl="7" w:tentative="1">
       <w:start w:val="1"/>
       <w:numFmt w:val="bullet"/>
-      <w:lvlText w:val="·"/>
+      <w:lvlText w:val=""/>
       <w:lvlJc w:val="left"/>
       <w:pPr>
         <w:tabs>
@@ -7613,7 +7570,7 @@
     <w:lvl w:ilvl="8" w:tentative="1">
       <w:start w:val="1"/>
       <w:numFmt w:val="bullet"/>
-      <w:lvlText w:val="·"/>
+      <w:lvlText w:val=""/>
       <w:lvlJc w:val="left"/>
       <w:pPr>
         <w:tabs>
@@ -7666,7 +7623,7 @@
     <w:lvl w:ilvl="2" w:tentative="1">
       <w:start w:val="1"/>
       <w:numFmt w:val="bullet"/>
-      <w:lvlText w:val="·"/>
+      <w:lvlText w:val=""/>
       <w:lvlJc w:val="left"/>
       <w:pPr>
         <w:tabs>
@@ -7682,7 +7639,7 @@
     <w:lvl w:ilvl="3" w:tentative="1">
       <w:start w:val="1"/>
       <w:numFmt w:val="bullet"/>
-      <w:lvlText w:val="·"/>
+      <w:lvlText w:val=""/>
       <w:lvlJc w:val="left"/>
       <w:pPr>
         <w:tabs>
@@ -7698,7 +7655,7 @@
     <w:lvl w:ilvl="4" w:tentative="1">
       <w:start w:val="1"/>
       <w:numFmt w:val="bullet"/>
-      <w:lvlText w:val="·"/>
+      <w:lvlText w:val=""/>
       <w:lvlJc w:val="left"/>
       <w:pPr>
         <w:tabs>
@@ -7714,7 +7671,7 @@
     <w:lvl w:ilvl="5" w:tentative="1">
       <w:start w:val="1"/>
       <w:numFmt w:val="bullet"/>
-      <w:lvlText w:val="·"/>
+      <w:lvlText w:val=""/>
       <w:lvlJc w:val="left"/>
       <w:pPr>
         <w:tabs>
@@ -7730,7 +7687,7 @@
     <w:lvl w:ilvl="6" w:tentative="1">
       <w:start w:val="1"/>
       <w:numFmt w:val="bullet"/>
-      <w:lvlText w:val="·"/>
+      <w:lvlText w:val=""/>
       <w:lvlJc w:val="left"/>
       <w:pPr>
         <w:tabs>
@@ -7746,7 +7703,7 @@
     <w:lvl w:ilvl="7" w:tentative="1">
       <w:start w:val="1"/>
       <w:numFmt w:val="bullet"/>
-      <w:lvlText w:val="·"/>
+      <w:lvlText w:val=""/>
       <w:lvlJc w:val="left"/>
       <w:pPr>
         <w:tabs>
@@ -7762,7 +7719,7 @@
     <w:lvl w:ilvl="8" w:tentative="1">
       <w:start w:val="1"/>
       <w:numFmt w:val="bullet"/>
-      <w:lvlText w:val="·"/>
+      <w:lvlText w:val=""/>
       <w:lvlJc w:val="left"/>
       <w:pPr>
         <w:tabs>
@@ -7815,7 +7772,7 @@
     <w:lvl w:ilvl="2" w:tentative="1">
       <w:start w:val="1"/>
       <w:numFmt w:val="bullet"/>
-      <w:lvlText w:val="·"/>
+      <w:lvlText w:val=""/>
       <w:lvlJc w:val="left"/>
       <w:pPr>
         <w:tabs>
@@ -7831,7 +7788,7 @@
     <w:lvl w:ilvl="3" w:tentative="1">
       <w:start w:val="1"/>
       <w:numFmt w:val="bullet"/>
-      <w:lvlText w:val="·"/>
+      <w:lvlText w:val=""/>
       <w:lvlJc w:val="left"/>
       <w:pPr>
         <w:tabs>
@@ -7847,7 +7804,7 @@
     <w:lvl w:ilvl="4" w:tentative="1">
       <w:start w:val="1"/>
       <w:numFmt w:val="bullet"/>
-      <w:lvlText w:val="·"/>
+      <w:lvlText w:val=""/>
       <w:lvlJc w:val="left"/>
       <w:pPr>
         <w:tabs>
@@ -7863,7 +7820,7 @@
     <w:lvl w:ilvl="5" w:tentative="1">
       <w:start w:val="1"/>
       <w:numFmt w:val="bullet"/>
-      <w:lvlText w:val="·"/>
+      <w:lvlText w:val=""/>
       <w:lvlJc w:val="left"/>
       <w:pPr>
         <w:tabs>
@@ -7879,7 +7836,7 @@
     <w:lvl w:ilvl="6" w:tentative="1">
       <w:start w:val="1"/>
       <w:numFmt w:val="bullet"/>
-      <w:lvlText w:val="·"/>
+      <w:lvlText w:val=""/>
       <w:lvlJc w:val="left"/>
       <w:pPr>
         <w:tabs>
@@ -7895,7 +7852,7 @@
     <w:lvl w:ilvl="7" w:tentative="1">
       <w:start w:val="1"/>
       <w:numFmt w:val="bullet"/>
-      <w:lvlText w:val="·"/>
+      <w:lvlText w:val=""/>
       <w:lvlJc w:val="left"/>
       <w:pPr>
         <w:tabs>
@@ -7911,7 +7868,7 @@
     <w:lvl w:ilvl="8" w:tentative="1">
       <w:start w:val="1"/>
       <w:numFmt w:val="bullet"/>
-      <w:lvlText w:val="·"/>
+      <w:lvlText w:val=""/>
       <w:lvlJc w:val="left"/>
       <w:pPr>
         <w:tabs>
@@ -7964,7 +7921,7 @@
     <w:lvl w:ilvl="2" w:tentative="1">
       <w:start w:val="1"/>
       <w:numFmt w:val="bullet"/>
-      <w:lvlText w:val="·"/>
+      <w:lvlText w:val=""/>
       <w:lvlJc w:val="left"/>
       <w:pPr>
         <w:tabs>
@@ -7980,7 +7937,7 @@
     <w:lvl w:ilvl="3" w:tentative="1">
       <w:start w:val="1"/>
       <w:numFmt w:val="bullet"/>
-      <w:lvlText w:val="·"/>
+      <w:lvlText w:val=""/>
       <w:lvlJc w:val="left"/>
       <w:pPr>
         <w:tabs>
@@ -7996,7 +7953,7 @@
     <w:lvl w:ilvl="4" w:tentative="1">
       <w:start w:val="1"/>
       <w:numFmt w:val="bullet"/>
-      <w:lvlText w:val="·"/>
+      <w:lvlText w:val=""/>
       <w:lvlJc w:val="left"/>
       <w:pPr>
         <w:tabs>
@@ -8012,7 +7969,7 @@
     <w:lvl w:ilvl="5" w:tentative="1">
       <w:start w:val="1"/>
       <w:numFmt w:val="bullet"/>
-      <w:lvlText w:val="·"/>
+      <w:lvlText w:val=""/>
       <w:lvlJc w:val="left"/>
       <w:pPr>
         <w:tabs>
@@ -8028,7 +7985,7 @@
     <w:lvl w:ilvl="6" w:tentative="1">
       <w:start w:val="1"/>
       <w:numFmt w:val="bullet"/>
-      <w:lvlText w:val="·"/>
+      <w:lvlText w:val=""/>
       <w:lvlJc w:val="left"/>
       <w:pPr>
         <w:tabs>
@@ -8044,7 +8001,7 @@
     <w:lvl w:ilvl="7" w:tentative="1">
       <w:start w:val="1"/>
       <w:numFmt w:val="bullet"/>
-      <w:lvlText w:val="·"/>
+      <w:lvlText w:val=""/>
       <w:lvlJc w:val="left"/>
       <w:pPr>
         <w:tabs>
@@ -8060,7 +8017,7 @@
     <w:lvl w:ilvl="8" w:tentative="1">
       <w:start w:val="1"/>
       <w:numFmt w:val="bullet"/>
-      <w:lvlText w:val="·"/>
+      <w:lvlText w:val=""/>
       <w:lvlJc w:val="left"/>
       <w:pPr>
         <w:tabs>

</xml_diff>